<commit_message>
feat: standardize date parsing, enhance Google Sheets formatting, and improve survey data mapping
</commit_message>
<xml_diff>
--- a/New Microsoft Word Document.docx
+++ b/New Microsoft Word Document.docx
@@ -21297,6 +21297,796 @@
       </w:r>
     </w:p>
     <w:p>
+      <w:pPr>
+        <w:pStyle w:val="Heading4"/>
+        <w:pBdr>
+          <w:top w:val="single" w:sz="2" w:space="0" w:color="auto"/>
+          <w:left w:val="single" w:sz="2" w:space="0" w:color="auto"/>
+          <w:bottom w:val="single" w:sz="2" w:space="0" w:color="auto"/>
+          <w:right w:val="single" w:sz="2" w:space="0" w:color="auto"/>
+        </w:pBdr>
+        <w:shd w:val="clear" w:color="auto" w:fill="181818"/>
+        <w:rPr>
+          <w:rFonts w:ascii="Segoe UI" w:hAnsi="Segoe UI" w:cs="Segoe UI"/>
+          <w:color w:val="CCCCCC"/>
+          <w:sz w:val="20"/>
+          <w:szCs w:val="20"/>
+        </w:rPr>
+      </w:pPr>
+      <w:r>
+        <w:rPr>
+          <w:rFonts w:ascii="Segoe UI Symbol" w:hAnsi="Segoe UI Symbol" w:cs="Segoe UI Symbol"/>
+          <w:b/>
+          <w:bCs/>
+          <w:color w:val="CCCCCC"/>
+          <w:sz w:val="20"/>
+          <w:szCs w:val="20"/>
+        </w:rPr>
+        <w:t>🌟</w:t>
+      </w:r>
+      <w:r>
+        <w:rPr>
+          <w:rFonts w:ascii="Segoe UI" w:hAnsi="Segoe UI" w:cs="Segoe UI"/>
+          <w:b/>
+          <w:bCs/>
+          <w:color w:val="CCCCCC"/>
+          <w:sz w:val="20"/>
+          <w:szCs w:val="20"/>
+        </w:rPr>
+        <w:t xml:space="preserve"> Cách 1: Thiết lập Biến môi trường trên Vercel (Triệt để 100% vĩnh viễn)</w:t>
+      </w:r>
+    </w:p>
+    <w:p>
+      <w:pPr>
+        <w:pStyle w:val="NormalWeb"/>
+        <w:pBdr>
+          <w:top w:val="single" w:sz="2" w:space="0" w:color="auto"/>
+          <w:left w:val="single" w:sz="2" w:space="0" w:color="auto"/>
+          <w:bottom w:val="single" w:sz="2" w:space="0" w:color="auto"/>
+          <w:right w:val="single" w:sz="2" w:space="0" w:color="auto"/>
+        </w:pBdr>
+        <w:shd w:val="clear" w:color="auto" w:fill="181818"/>
+        <w:spacing w:before="0" w:beforeAutospacing="0" w:after="0" w:afterAutospacing="0"/>
+        <w:rPr>
+          <w:rFonts w:ascii="Segoe UI" w:hAnsi="Segoe UI" w:cs="Segoe UI"/>
+          <w:color w:val="CCCCCC"/>
+          <w:sz w:val="20"/>
+          <w:szCs w:val="20"/>
+        </w:rPr>
+      </w:pPr>
+      <w:r>
+        <w:rPr>
+          <w:rStyle w:val="Emphasis"/>
+          <w:rFonts w:ascii="Segoe UI" w:hAnsi="Segoe UI" w:cs="Segoe UI"/>
+          <w:color w:val="CCCCCC"/>
+          <w:sz w:val="20"/>
+          <w:szCs w:val="20"/>
+          <w:bdr w:val="single" w:sz="2" w:space="0" w:color="auto" w:frame="1"/>
+        </w:rPr>
+        <w:t>Cách này giúp đường dẫn được lưu cố định trên hạ tầng Vercel. Dù bạn đăng nhập từ máy tính cơ quan, máy tính ở nhà hay điện thoại, đường dẫn luôn luôn sẵn sàng và không bao giờ mất.</w:t>
+      </w:r>
+    </w:p>
+    <w:p>
+      <w:pPr>
+        <w:numPr>
+          <w:ilvl w:val="0"/>
+          <w:numId w:val="15"/>
+        </w:numPr>
+        <w:pBdr>
+          <w:top w:val="single" w:sz="2" w:space="0" w:color="auto"/>
+          <w:left w:val="single" w:sz="2" w:space="0" w:color="auto"/>
+          <w:bottom w:val="single" w:sz="2" w:space="0" w:color="auto"/>
+          <w:right w:val="single" w:sz="2" w:space="0" w:color="auto"/>
+        </w:pBdr>
+        <w:shd w:val="clear" w:color="auto" w:fill="181818"/>
+        <w:spacing w:before="100" w:beforeAutospacing="1" w:after="100" w:afterAutospacing="1" w:line="240" w:lineRule="auto"/>
+        <w:rPr>
+          <w:rFonts w:ascii="Segoe UI" w:hAnsi="Segoe UI" w:cs="Segoe UI"/>
+          <w:color w:val="CCCCCC"/>
+          <w:sz w:val="20"/>
+          <w:szCs w:val="20"/>
+        </w:rPr>
+      </w:pPr>
+      <w:r>
+        <w:rPr>
+          <w:rFonts w:ascii="Segoe UI" w:hAnsi="Segoe UI" w:cs="Segoe UI"/>
+          <w:color w:val="CCCCCC"/>
+          <w:sz w:val="20"/>
+          <w:szCs w:val="20"/>
+        </w:rPr>
+        <w:t>Truy cập vào </w:t>
+      </w:r>
+      <w:hyperlink r:id="rId6" w:history="1">
+        <w:r>
+          <w:rPr>
+            <w:rStyle w:val="Hyperlink"/>
+            <w:rFonts w:ascii="Segoe UI" w:hAnsi="Segoe UI" w:cs="Segoe UI"/>
+            <w:color w:val="4DAAFC"/>
+            <w:sz w:val="20"/>
+            <w:szCs w:val="20"/>
+            <w:bdr w:val="single" w:sz="2" w:space="0" w:color="auto" w:frame="1"/>
+          </w:rPr>
+          <w:t>Vercel Dashboard</w:t>
+        </w:r>
+      </w:hyperlink>
+      <w:r>
+        <w:rPr>
+          <w:rFonts w:ascii="Segoe UI" w:hAnsi="Segoe UI" w:cs="Segoe UI"/>
+          <w:color w:val="CCCCCC"/>
+          <w:sz w:val="20"/>
+          <w:szCs w:val="20"/>
+        </w:rPr>
+        <w:t> và đăng nhập.</w:t>
+      </w:r>
+    </w:p>
+    <w:p>
+      <w:pPr>
+        <w:numPr>
+          <w:ilvl w:val="0"/>
+          <w:numId w:val="15"/>
+        </w:numPr>
+        <w:pBdr>
+          <w:top w:val="single" w:sz="2" w:space="0" w:color="auto"/>
+          <w:left w:val="single" w:sz="2" w:space="0" w:color="auto"/>
+          <w:bottom w:val="single" w:sz="2" w:space="0" w:color="auto"/>
+          <w:right w:val="single" w:sz="2" w:space="0" w:color="auto"/>
+        </w:pBdr>
+        <w:shd w:val="clear" w:color="auto" w:fill="181818"/>
+        <w:spacing w:before="100" w:beforeAutospacing="1" w:after="100" w:afterAutospacing="1" w:line="240" w:lineRule="auto"/>
+        <w:rPr>
+          <w:rFonts w:ascii="Segoe UI" w:hAnsi="Segoe UI" w:cs="Segoe UI"/>
+          <w:color w:val="CCCCCC"/>
+          <w:sz w:val="20"/>
+          <w:szCs w:val="20"/>
+        </w:rPr>
+      </w:pPr>
+      <w:r>
+        <w:rPr>
+          <w:rFonts w:ascii="Segoe UI" w:hAnsi="Segoe UI" w:cs="Segoe UI"/>
+          <w:color w:val="CCCCCC"/>
+          <w:sz w:val="20"/>
+          <w:szCs w:val="20"/>
+        </w:rPr>
+        <w:t>Bấm chọn dự án khảo sát của bạn.</w:t>
+      </w:r>
+    </w:p>
+    <w:p>
+      <w:pPr>
+        <w:numPr>
+          <w:ilvl w:val="0"/>
+          <w:numId w:val="15"/>
+        </w:numPr>
+        <w:pBdr>
+          <w:top w:val="single" w:sz="2" w:space="0" w:color="auto"/>
+          <w:left w:val="single" w:sz="2" w:space="0" w:color="auto"/>
+          <w:bottom w:val="single" w:sz="2" w:space="0" w:color="auto"/>
+          <w:right w:val="single" w:sz="2" w:space="0" w:color="auto"/>
+        </w:pBdr>
+        <w:shd w:val="clear" w:color="auto" w:fill="181818"/>
+        <w:spacing w:before="100" w:beforeAutospacing="1" w:after="100" w:afterAutospacing="1" w:line="240" w:lineRule="auto"/>
+        <w:rPr>
+          <w:rFonts w:ascii="Segoe UI" w:hAnsi="Segoe UI" w:cs="Segoe UI"/>
+          <w:color w:val="CCCCCC"/>
+          <w:sz w:val="20"/>
+          <w:szCs w:val="20"/>
+        </w:rPr>
+      </w:pPr>
+      <w:r>
+        <w:rPr>
+          <w:rFonts w:ascii="Segoe UI" w:hAnsi="Segoe UI" w:cs="Segoe UI"/>
+          <w:color w:val="CCCCCC"/>
+          <w:sz w:val="20"/>
+          <w:szCs w:val="20"/>
+        </w:rPr>
+        <w:t>Vào tab </w:t>
+      </w:r>
+      <w:r>
+        <w:rPr>
+          <w:rStyle w:val="Strong"/>
+          <w:rFonts w:ascii="Segoe UI" w:hAnsi="Segoe UI" w:cs="Segoe UI"/>
+          <w:color w:val="CCCCCC"/>
+          <w:sz w:val="20"/>
+          <w:szCs w:val="20"/>
+          <w:bdr w:val="single" w:sz="2" w:space="0" w:color="auto" w:frame="1"/>
+        </w:rPr>
+        <w:t>Settings</w:t>
+      </w:r>
+      <w:r>
+        <w:rPr>
+          <w:rFonts w:ascii="Segoe UI" w:hAnsi="Segoe UI" w:cs="Segoe UI"/>
+          <w:color w:val="CCCCCC"/>
+          <w:sz w:val="20"/>
+          <w:szCs w:val="20"/>
+        </w:rPr>
+        <w:t> </w:t>
+      </w:r>
+      <w:r>
+        <w:rPr>
+          <w:rFonts w:ascii="Segoe UI Symbol" w:hAnsi="Segoe UI Symbol" w:cs="Segoe UI Symbol"/>
+          <w:color w:val="CCCCCC"/>
+          <w:sz w:val="20"/>
+          <w:szCs w:val="20"/>
+        </w:rPr>
+        <w:t>➔</w:t>
+      </w:r>
+      <w:r>
+        <w:rPr>
+          <w:rFonts w:ascii="Segoe UI" w:hAnsi="Segoe UI" w:cs="Segoe UI"/>
+          <w:color w:val="CCCCCC"/>
+          <w:sz w:val="20"/>
+          <w:szCs w:val="20"/>
+        </w:rPr>
+        <w:t xml:space="preserve"> chọn mục </w:t>
+      </w:r>
+      <w:r>
+        <w:rPr>
+          <w:rStyle w:val="Strong"/>
+          <w:rFonts w:ascii="Segoe UI" w:hAnsi="Segoe UI" w:cs="Segoe UI"/>
+          <w:color w:val="CCCCCC"/>
+          <w:sz w:val="20"/>
+          <w:szCs w:val="20"/>
+          <w:bdr w:val="single" w:sz="2" w:space="0" w:color="auto" w:frame="1"/>
+        </w:rPr>
+        <w:t>Environment Variables</w:t>
+      </w:r>
+      <w:r>
+        <w:rPr>
+          <w:rFonts w:ascii="Segoe UI" w:hAnsi="Segoe UI" w:cs="Segoe UI"/>
+          <w:color w:val="CCCCCC"/>
+          <w:sz w:val="20"/>
+          <w:szCs w:val="20"/>
+        </w:rPr>
+        <w:t> ở menu bên trái.</w:t>
+      </w:r>
+    </w:p>
+    <w:p>
+      <w:pPr>
+        <w:numPr>
+          <w:ilvl w:val="0"/>
+          <w:numId w:val="15"/>
+        </w:numPr>
+        <w:pBdr>
+          <w:top w:val="single" w:sz="2" w:space="0" w:color="auto"/>
+          <w:left w:val="single" w:sz="2" w:space="0" w:color="auto"/>
+          <w:bottom w:val="single" w:sz="2" w:space="0" w:color="auto"/>
+          <w:right w:val="single" w:sz="2" w:space="0" w:color="auto"/>
+        </w:pBdr>
+        <w:shd w:val="clear" w:color="auto" w:fill="181818"/>
+        <w:spacing w:before="100" w:beforeAutospacing="1" w:after="100" w:afterAutospacing="1" w:line="240" w:lineRule="auto"/>
+        <w:rPr>
+          <w:rFonts w:ascii="Segoe UI" w:hAnsi="Segoe UI" w:cs="Segoe UI"/>
+          <w:color w:val="CCCCCC"/>
+          <w:sz w:val="20"/>
+          <w:szCs w:val="20"/>
+        </w:rPr>
+      </w:pPr>
+      <w:r>
+        <w:rPr>
+          <w:rFonts w:ascii="Segoe UI" w:hAnsi="Segoe UI" w:cs="Segoe UI"/>
+          <w:color w:val="CCCCCC"/>
+          <w:sz w:val="20"/>
+          <w:szCs w:val="20"/>
+        </w:rPr>
+        <w:t>Thêm biến môi trường mới:</w:t>
+      </w:r>
+    </w:p>
+    <w:p>
+      <w:pPr>
+        <w:numPr>
+          <w:ilvl w:val="1"/>
+          <w:numId w:val="15"/>
+        </w:numPr>
+        <w:pBdr>
+          <w:top w:val="single" w:sz="2" w:space="0" w:color="auto"/>
+          <w:left w:val="single" w:sz="2" w:space="0" w:color="auto"/>
+          <w:bottom w:val="single" w:sz="2" w:space="0" w:color="auto"/>
+          <w:right w:val="single" w:sz="2" w:space="0" w:color="auto"/>
+        </w:pBdr>
+        <w:shd w:val="clear" w:color="auto" w:fill="181818"/>
+        <w:spacing w:before="100" w:beforeAutospacing="1" w:after="100" w:afterAutospacing="1" w:line="240" w:lineRule="auto"/>
+        <w:rPr>
+          <w:rFonts w:ascii="Segoe UI" w:hAnsi="Segoe UI" w:cs="Segoe UI"/>
+          <w:color w:val="CCCCCC"/>
+          <w:sz w:val="20"/>
+          <w:szCs w:val="20"/>
+        </w:rPr>
+      </w:pPr>
+      <w:r>
+        <w:rPr>
+          <w:rStyle w:val="Strong"/>
+          <w:rFonts w:ascii="Segoe UI" w:hAnsi="Segoe UI" w:cs="Segoe UI"/>
+          <w:color w:val="CCCCCC"/>
+          <w:sz w:val="20"/>
+          <w:szCs w:val="20"/>
+          <w:bdr w:val="single" w:sz="2" w:space="0" w:color="auto" w:frame="1"/>
+        </w:rPr>
+        <w:t>Key (Tên biến):</w:t>
+      </w:r>
+      <w:r>
+        <w:rPr>
+          <w:rFonts w:ascii="Segoe UI" w:hAnsi="Segoe UI" w:cs="Segoe UI"/>
+          <w:color w:val="CCCCCC"/>
+          <w:sz w:val="20"/>
+          <w:szCs w:val="20"/>
+        </w:rPr>
+        <w:t> </w:t>
+      </w:r>
+      <w:r>
+        <w:rPr>
+          <w:rStyle w:val="HTMLCode"/>
+          <w:rFonts w:ascii="Consolas" w:eastAsiaTheme="minorHAnsi" w:hAnsi="Consolas"/>
+          <w:color w:val="D0D0D0"/>
+          <w:sz w:val="18"/>
+          <w:szCs w:val="18"/>
+          <w:bdr w:val="single" w:sz="2" w:space="0" w:color="auto" w:frame="1"/>
+          <w:shd w:val="clear" w:color="auto" w:fill="3C3C3C"/>
+        </w:rPr>
+        <w:t>GOOGLE_SHEET_WEBHOOK_URL</w:t>
+      </w:r>
+    </w:p>
+    <w:p>
+      <w:pPr>
+        <w:numPr>
+          <w:ilvl w:val="1"/>
+          <w:numId w:val="15"/>
+        </w:numPr>
+        <w:pBdr>
+          <w:top w:val="single" w:sz="2" w:space="0" w:color="auto"/>
+          <w:left w:val="single" w:sz="2" w:space="0" w:color="auto"/>
+          <w:bottom w:val="single" w:sz="2" w:space="0" w:color="auto"/>
+          <w:right w:val="single" w:sz="2" w:space="0" w:color="auto"/>
+        </w:pBdr>
+        <w:shd w:val="clear" w:color="auto" w:fill="181818"/>
+        <w:spacing w:before="100" w:beforeAutospacing="1" w:after="100" w:afterAutospacing="1" w:line="240" w:lineRule="auto"/>
+        <w:rPr>
+          <w:rFonts w:ascii="Segoe UI" w:hAnsi="Segoe UI" w:cs="Segoe UI"/>
+          <w:color w:val="CCCCCC"/>
+          <w:sz w:val="20"/>
+          <w:szCs w:val="20"/>
+        </w:rPr>
+      </w:pPr>
+      <w:r>
+        <w:rPr>
+          <w:rStyle w:val="Strong"/>
+          <w:rFonts w:ascii="Segoe UI" w:hAnsi="Segoe UI" w:cs="Segoe UI"/>
+          <w:color w:val="CCCCCC"/>
+          <w:sz w:val="20"/>
+          <w:szCs w:val="20"/>
+          <w:bdr w:val="single" w:sz="2" w:space="0" w:color="auto" w:frame="1"/>
+        </w:rPr>
+        <w:t>Value (Giá trị):</w:t>
+      </w:r>
+      <w:r>
+        <w:rPr>
+          <w:rFonts w:ascii="Segoe UI" w:hAnsi="Segoe UI" w:cs="Segoe UI"/>
+          <w:color w:val="CCCCCC"/>
+          <w:sz w:val="20"/>
+          <w:szCs w:val="20"/>
+        </w:rPr>
+        <w:t> Dán link Google Apps Script Webhook của bạn (dạng: </w:t>
+      </w:r>
+      <w:r>
+        <w:rPr>
+          <w:rStyle w:val="HTMLCode"/>
+          <w:rFonts w:ascii="Consolas" w:eastAsiaTheme="minorHAnsi" w:hAnsi="Consolas"/>
+          <w:color w:val="D0D0D0"/>
+          <w:sz w:val="18"/>
+          <w:szCs w:val="18"/>
+          <w:bdr w:val="single" w:sz="2" w:space="0" w:color="auto" w:frame="1"/>
+          <w:shd w:val="clear" w:color="auto" w:fill="3C3C3C"/>
+        </w:rPr>
+        <w:t>https://script.google.com/macros/s/AKfycb.../exec</w:t>
+      </w:r>
+      <w:r>
+        <w:rPr>
+          <w:rFonts w:ascii="Segoe UI" w:hAnsi="Segoe UI" w:cs="Segoe UI"/>
+          <w:color w:val="CCCCCC"/>
+          <w:sz w:val="20"/>
+          <w:szCs w:val="20"/>
+        </w:rPr>
+        <w:t>).</w:t>
+      </w:r>
+    </w:p>
+    <w:p>
+      <w:pPr>
+        <w:numPr>
+          <w:ilvl w:val="1"/>
+          <w:numId w:val="15"/>
+        </w:numPr>
+        <w:pBdr>
+          <w:top w:val="single" w:sz="2" w:space="0" w:color="auto"/>
+          <w:left w:val="single" w:sz="2" w:space="0" w:color="auto"/>
+          <w:bottom w:val="single" w:sz="2" w:space="0" w:color="auto"/>
+          <w:right w:val="single" w:sz="2" w:space="0" w:color="auto"/>
+        </w:pBdr>
+        <w:shd w:val="clear" w:color="auto" w:fill="181818"/>
+        <w:spacing w:before="100" w:beforeAutospacing="1" w:after="100" w:afterAutospacing="1" w:line="240" w:lineRule="auto"/>
+        <w:rPr>
+          <w:rFonts w:ascii="Segoe UI" w:hAnsi="Segoe UI" w:cs="Segoe UI"/>
+          <w:color w:val="CCCCCC"/>
+          <w:sz w:val="20"/>
+          <w:szCs w:val="20"/>
+        </w:rPr>
+      </w:pPr>
+      <w:r>
+        <w:rPr>
+          <w:rFonts w:ascii="Segoe UI" w:hAnsi="Segoe UI" w:cs="Segoe UI"/>
+          <w:color w:val="CCCCCC"/>
+          <w:sz w:val="20"/>
+          <w:szCs w:val="20"/>
+        </w:rPr>
+        <w:t>Tích chọn cả 3 môi trường: </w:t>
+      </w:r>
+      <w:r>
+        <w:rPr>
+          <w:rStyle w:val="HTMLCode"/>
+          <w:rFonts w:ascii="Consolas" w:eastAsiaTheme="minorHAnsi" w:hAnsi="Consolas"/>
+          <w:color w:val="D0D0D0"/>
+          <w:sz w:val="18"/>
+          <w:szCs w:val="18"/>
+          <w:bdr w:val="single" w:sz="2" w:space="0" w:color="auto" w:frame="1"/>
+          <w:shd w:val="clear" w:color="auto" w:fill="3C3C3C"/>
+        </w:rPr>
+        <w:t>Production</w:t>
+      </w:r>
+      <w:r>
+        <w:rPr>
+          <w:rFonts w:ascii="Segoe UI" w:hAnsi="Segoe UI" w:cs="Segoe UI"/>
+          <w:color w:val="CCCCCC"/>
+          <w:sz w:val="20"/>
+          <w:szCs w:val="20"/>
+        </w:rPr>
+        <w:t>, </w:t>
+      </w:r>
+      <w:r>
+        <w:rPr>
+          <w:rStyle w:val="HTMLCode"/>
+          <w:rFonts w:ascii="Consolas" w:eastAsiaTheme="minorHAnsi" w:hAnsi="Consolas"/>
+          <w:color w:val="D0D0D0"/>
+          <w:sz w:val="18"/>
+          <w:szCs w:val="18"/>
+          <w:bdr w:val="single" w:sz="2" w:space="0" w:color="auto" w:frame="1"/>
+          <w:shd w:val="clear" w:color="auto" w:fill="3C3C3C"/>
+        </w:rPr>
+        <w:t>Preview</w:t>
+      </w:r>
+      <w:r>
+        <w:rPr>
+          <w:rFonts w:ascii="Segoe UI" w:hAnsi="Segoe UI" w:cs="Segoe UI"/>
+          <w:color w:val="CCCCCC"/>
+          <w:sz w:val="20"/>
+          <w:szCs w:val="20"/>
+        </w:rPr>
+        <w:t>, </w:t>
+      </w:r>
+      <w:r>
+        <w:rPr>
+          <w:rStyle w:val="HTMLCode"/>
+          <w:rFonts w:ascii="Consolas" w:eastAsiaTheme="minorHAnsi" w:hAnsi="Consolas"/>
+          <w:color w:val="D0D0D0"/>
+          <w:sz w:val="18"/>
+          <w:szCs w:val="18"/>
+          <w:bdr w:val="single" w:sz="2" w:space="0" w:color="auto" w:frame="1"/>
+          <w:shd w:val="clear" w:color="auto" w:fill="3C3C3C"/>
+        </w:rPr>
+        <w:t>Development</w:t>
+      </w:r>
+      <w:r>
+        <w:rPr>
+          <w:rFonts w:ascii="Segoe UI" w:hAnsi="Segoe UI" w:cs="Segoe UI"/>
+          <w:color w:val="CCCCCC"/>
+          <w:sz w:val="20"/>
+          <w:szCs w:val="20"/>
+        </w:rPr>
+        <w:t>.</w:t>
+      </w:r>
+    </w:p>
+    <w:p>
+      <w:pPr>
+        <w:numPr>
+          <w:ilvl w:val="0"/>
+          <w:numId w:val="15"/>
+        </w:numPr>
+        <w:pBdr>
+          <w:top w:val="single" w:sz="2" w:space="0" w:color="auto"/>
+          <w:left w:val="single" w:sz="2" w:space="0" w:color="auto"/>
+          <w:bottom w:val="single" w:sz="2" w:space="0" w:color="auto"/>
+          <w:right w:val="single" w:sz="2" w:space="0" w:color="auto"/>
+        </w:pBdr>
+        <w:shd w:val="clear" w:color="auto" w:fill="181818"/>
+        <w:spacing w:before="100" w:beforeAutospacing="1" w:after="100" w:afterAutospacing="1" w:line="240" w:lineRule="auto"/>
+        <w:rPr>
+          <w:rFonts w:ascii="Segoe UI" w:hAnsi="Segoe UI" w:cs="Segoe UI"/>
+          <w:color w:val="CCCCCC"/>
+          <w:sz w:val="20"/>
+          <w:szCs w:val="20"/>
+        </w:rPr>
+      </w:pPr>
+      <w:r>
+        <w:rPr>
+          <w:rFonts w:ascii="Segoe UI" w:hAnsi="Segoe UI" w:cs="Segoe UI"/>
+          <w:color w:val="CCCCCC"/>
+          <w:sz w:val="20"/>
+          <w:szCs w:val="20"/>
+        </w:rPr>
+        <w:t>Bấm </w:t>
+      </w:r>
+      <w:r>
+        <w:rPr>
+          <w:rStyle w:val="Strong"/>
+          <w:rFonts w:ascii="Segoe UI" w:hAnsi="Segoe UI" w:cs="Segoe UI"/>
+          <w:color w:val="CCCCCC"/>
+          <w:sz w:val="20"/>
+          <w:szCs w:val="20"/>
+          <w:bdr w:val="single" w:sz="2" w:space="0" w:color="auto" w:frame="1"/>
+        </w:rPr>
+        <w:t>Save</w:t>
+      </w:r>
+      <w:r>
+        <w:rPr>
+          <w:rFonts w:ascii="Segoe UI" w:hAnsi="Segoe UI" w:cs="Segoe UI"/>
+          <w:color w:val="CCCCCC"/>
+          <w:sz w:val="20"/>
+          <w:szCs w:val="20"/>
+        </w:rPr>
+        <w:t>.</w:t>
+      </w:r>
+    </w:p>
+    <w:p>
+      <w:pPr>
+        <w:numPr>
+          <w:ilvl w:val="0"/>
+          <w:numId w:val="15"/>
+        </w:numPr>
+        <w:pBdr>
+          <w:top w:val="single" w:sz="2" w:space="0" w:color="auto"/>
+          <w:left w:val="single" w:sz="2" w:space="0" w:color="auto"/>
+          <w:bottom w:val="single" w:sz="2" w:space="0" w:color="auto"/>
+          <w:right w:val="single" w:sz="2" w:space="0" w:color="auto"/>
+        </w:pBdr>
+        <w:shd w:val="clear" w:color="auto" w:fill="181818"/>
+        <w:spacing w:before="100" w:beforeAutospacing="1" w:after="100" w:afterAutospacing="1" w:line="240" w:lineRule="auto"/>
+        <w:rPr>
+          <w:rStyle w:val="context-scope-mention"/>
+          <w:bdr w:val="single" w:sz="2" w:space="0" w:color="auto" w:frame="1"/>
+        </w:rPr>
+      </w:pPr>
+      <w:r>
+        <w:rPr>
+          <w:rFonts w:ascii="Segoe UI" w:hAnsi="Segoe UI" w:cs="Segoe UI"/>
+          <w:color w:val="CCCCCC"/>
+          <w:sz w:val="20"/>
+          <w:szCs w:val="20"/>
+        </w:rPr>
+        <w:t>Vào tab </w:t>
+      </w:r>
+      <w:r>
+        <w:rPr>
+          <w:rStyle w:val="Strong"/>
+          <w:rFonts w:ascii="Segoe UI" w:hAnsi="Segoe UI" w:cs="Segoe UI"/>
+          <w:color w:val="CCCCCC"/>
+          <w:sz w:val="20"/>
+          <w:szCs w:val="20"/>
+          <w:bdr w:val="single" w:sz="2" w:space="0" w:color="auto" w:frame="1"/>
+        </w:rPr>
+        <w:t>Deployments</w:t>
+      </w:r>
+      <w:r>
+        <w:rPr>
+          <w:rFonts w:ascii="Segoe UI" w:hAnsi="Segoe UI" w:cs="Segoe UI"/>
+          <w:color w:val="CCCCCC"/>
+          <w:sz w:val="20"/>
+          <w:szCs w:val="20"/>
+        </w:rPr>
+        <w:t> </w:t>
+      </w:r>
+      <w:r>
+        <w:rPr>
+          <w:rFonts w:ascii="Segoe UI Symbol" w:hAnsi="Segoe UI Symbol" w:cs="Segoe UI Symbol"/>
+          <w:color w:val="CCCCCC"/>
+          <w:sz w:val="20"/>
+          <w:szCs w:val="20"/>
+        </w:rPr>
+        <w:t>➔</w:t>
+      </w:r>
+      <w:r>
+        <w:rPr>
+          <w:rFonts w:ascii="Segoe UI" w:hAnsi="Segoe UI" w:cs="Segoe UI"/>
+          <w:color w:val="CCCCCC"/>
+          <w:sz w:val="20"/>
+          <w:szCs w:val="20"/>
+        </w:rPr>
+        <w:t xml:space="preserve"> Bấm vào dấu </w:t>
+      </w:r>
+      <w:r>
+        <w:rPr>
+          <w:rStyle w:val="HTMLCode"/>
+          <w:rFonts w:ascii="Consolas" w:eastAsiaTheme="minorHAnsi" w:hAnsi="Consolas"/>
+          <w:color w:val="D0D0D0"/>
+          <w:sz w:val="18"/>
+          <w:szCs w:val="18"/>
+          <w:bdr w:val="single" w:sz="2" w:space="0" w:color="auto" w:frame="1"/>
+          <w:shd w:val="clear" w:color="auto" w:fill="3C3C3C"/>
+        </w:rPr>
+        <w:t>...</w:t>
+      </w:r>
+      <w:r>
+        <w:rPr>
+          <w:rFonts w:ascii="Segoe UI" w:hAnsi="Segoe UI" w:cs="Segoe UI"/>
+          <w:color w:val="CCCCCC"/>
+          <w:sz w:val="20"/>
+          <w:szCs w:val="20"/>
+        </w:rPr>
+        <w:t xml:space="preserve"> ở bản deploy trên cùng </w:t>
+      </w:r>
+      <w:r>
+        <w:rPr>
+          <w:rFonts w:ascii="Segoe UI Symbol" w:hAnsi="Segoe UI Symbol" w:cs="Segoe UI Symbol"/>
+          <w:color w:val="CCCCCC"/>
+          <w:sz w:val="20"/>
+          <w:szCs w:val="20"/>
+        </w:rPr>
+        <w:t>➔</w:t>
+      </w:r>
+      <w:r>
+        <w:rPr>
+          <w:rFonts w:ascii="Segoe UI" w:hAnsi="Segoe UI" w:cs="Segoe UI"/>
+          <w:color w:val="CCCCCC"/>
+          <w:sz w:val="20"/>
+          <w:szCs w:val="20"/>
+        </w:rPr>
+        <w:t xml:space="preserve"> Chọn </w:t>
+      </w:r>
+      <w:r>
+        <w:rPr>
+          <w:rStyle w:val="Strong"/>
+          <w:rFonts w:ascii="Segoe UI" w:hAnsi="Segoe UI" w:cs="Segoe UI"/>
+          <w:color w:val="CCCCCC"/>
+          <w:sz w:val="20"/>
+          <w:szCs w:val="20"/>
+          <w:bdr w:val="single" w:sz="2" w:space="0" w:color="auto" w:frame="1"/>
+        </w:rPr>
+        <w:t>Redeploy</w:t>
+      </w:r>
+      <w:r>
+        <w:rPr>
+          <w:rFonts w:ascii="Segoe UI" w:hAnsi="Segoe UI" w:cs="Segoe UI"/>
+          <w:color w:val="CCCCCC"/>
+          <w:sz w:val="20"/>
+          <w:szCs w:val="20"/>
+        </w:rPr>
+        <w:t> (hoặc chạy lại file </w:t>
+      </w:r>
+    </w:p>
+    <w:p>
+      <w:pPr>
+        <w:pBdr>
+          <w:top w:val="single" w:sz="2" w:space="0" w:color="auto"/>
+          <w:left w:val="single" w:sz="2" w:space="0" w:color="auto"/>
+          <w:bottom w:val="single" w:sz="2" w:space="0" w:color="auto"/>
+          <w:right w:val="single" w:sz="2" w:space="0" w:color="auto"/>
+        </w:pBdr>
+        <w:shd w:val="clear" w:color="auto" w:fill="181818"/>
+        <w:spacing w:before="100" w:beforeAutospacing="1" w:after="100" w:afterAutospacing="1"/>
+        <w:ind w:left="720"/>
+      </w:pPr>
+      <w:r>
+        <w:rPr>
+          <w:rFonts w:ascii="Segoe UI" w:hAnsi="Segoe UI" w:cs="Segoe UI"/>
+          <w:noProof/>
+          <w:color w:val="CCCCCC"/>
+          <w:sz w:val="20"/>
+          <w:szCs w:val="20"/>
+          <w:bdr w:val="single" w:sz="2" w:space="0" w:color="auto" w:frame="1"/>
+        </w:rPr>
+        <mc:AlternateContent>
+          <mc:Choice Requires="wps">
+            <w:drawing>
+              <wp:inline distT="0" distB="0" distL="0" distR="0">
+                <wp:extent cx="302895" cy="302895"/>
+                <wp:effectExtent l="0" t="0" r="0" b="0"/>
+                <wp:docPr id="9" name="Rectangle 9" descr="vscode-file://vscode-app/c:/Users/TCCB/AppData/Local/Programs/Antigravity%20IDE/resources/app/extensions/theme-symbols/src/icons/files/shell.svg"/>
+                <wp:cNvGraphicFramePr>
+                  <a:graphicFrameLocks xmlns:a="http://schemas.openxmlformats.org/drawingml/2006/main" noChangeAspect="1"/>
+                </wp:cNvGraphicFramePr>
+                <a:graphic xmlns:a="http://schemas.openxmlformats.org/drawingml/2006/main">
+                  <a:graphicData uri="http://schemas.microsoft.com/office/word/2010/wordprocessingShape">
+                    <wps:wsp>
+                      <wps:cNvSpPr>
+                        <a:spLocks noChangeAspect="1" noChangeArrowheads="1"/>
+                      </wps:cNvSpPr>
+                      <wps:spPr bwMode="auto">
+                        <a:xfrm>
+                          <a:off x="0" y="0"/>
+                          <a:ext cx="302895" cy="302895"/>
+                        </a:xfrm>
+                        <a:prstGeom prst="rect">
+                          <a:avLst/>
+                        </a:prstGeom>
+                        <a:noFill/>
+                        <a:ln>
+                          <a:noFill/>
+                        </a:ln>
+                        <a:extLst>
+                          <a:ext uri="{909E8E84-426E-40DD-AFC4-6F175D3DCCD1}">
+                            <a14:hiddenFill xmlns:a14="http://schemas.microsoft.com/office/drawing/2010/main">
+                              <a:solidFill>
+                                <a:srgbClr val="FFFFFF"/>
+                              </a:solidFill>
+                            </a14:hiddenFill>
+                          </a:ext>
+                          <a:ext uri="{91240B29-F687-4F45-9708-019B960494DF}">
+                            <a14:hiddenLine xmlns:a14="http://schemas.microsoft.com/office/drawing/2010/main" w="9525">
+                              <a:solidFill>
+                                <a:srgbClr val="000000"/>
+                              </a:solidFill>
+                              <a:miter lim="800000"/>
+                              <a:headEnd/>
+                              <a:tailEnd/>
+                            </a14:hiddenLine>
+                          </a:ext>
+                        </a:extLst>
+                      </wps:spPr>
+                      <wps:bodyPr rot="0" vert="horz" wrap="square" lIns="91440" tIns="45720" rIns="91440" bIns="45720" anchor="t" anchorCtr="0" upright="1">
+                        <a:noAutofit/>
+                      </wps:bodyPr>
+                    </wps:wsp>
+                  </a:graphicData>
+                </a:graphic>
+              </wp:inline>
+            </w:drawing>
+          </mc:Choice>
+          <mc:Fallback>
+            <w:pict>
+              <v:rect w14:anchorId="32AAAC36" id="Rectangle 9" o:spid="_x0000_s1026" alt="vscode-file://vscode-app/c:/Users/TCCB/AppData/Local/Programs/Antigravity%20IDE/resources/app/extensions/theme-symbols/src/icons/files/shell.svg" style="width:23.85pt;height:23.85pt;visibility:visible;mso-wrap-style:square;mso-left-percent:-10001;mso-top-percent:-10001;mso-position-horizontal:absolute;mso-position-horizontal-relative:char;mso-position-vertical:absolute;mso-position-vertical-relative:line;mso-left-percent:-10001;mso-top-percent:-10001;v-text-anchor:top" o:gfxdata="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" filled="f" stroked="f">
+                <o:lock v:ext="edit" aspectratio="t"/>
+                <w10:anchorlock/>
+              </v:rect>
+            </w:pict>
+          </mc:Fallback>
+        </mc:AlternateContent>
+      </w:r>
+    </w:p>
+    <w:p>
+      <w:pPr>
+        <w:pBdr>
+          <w:top w:val="single" w:sz="2" w:space="0" w:color="auto"/>
+          <w:left w:val="single" w:sz="2" w:space="0" w:color="auto"/>
+          <w:bottom w:val="single" w:sz="2" w:space="0" w:color="auto"/>
+          <w:right w:val="single" w:sz="2" w:space="0" w:color="auto"/>
+        </w:pBdr>
+        <w:shd w:val="clear" w:color="auto" w:fill="181818"/>
+        <w:spacing w:before="100" w:beforeAutospacing="1" w:after="100" w:afterAutospacing="1"/>
+        <w:ind w:left="720"/>
+        <w:rPr>
+          <w:rFonts w:ascii="Segoe UI" w:hAnsi="Segoe UI" w:cs="Segoe UI"/>
+          <w:color w:val="CCCCCC"/>
+          <w:sz w:val="20"/>
+          <w:szCs w:val="20"/>
+        </w:rPr>
+      </w:pPr>
+      <w:r>
+        <w:rPr>
+          <w:rStyle w:val="inline-flex"/>
+          <w:rFonts w:ascii="Segoe UI" w:hAnsi="Segoe UI" w:cs="Segoe UI"/>
+          <w:color w:val="CCCCCC"/>
+          <w:sz w:val="20"/>
+          <w:szCs w:val="20"/>
+          <w:bdr w:val="single" w:sz="2" w:space="0" w:color="auto" w:frame="1"/>
+        </w:rPr>
+        <w:t>DEPLOY_LEN_VERCEL.bat</w:t>
+      </w:r>
+      <w:r>
+        <w:rPr>
+          <w:rFonts w:ascii="Segoe UI" w:hAnsi="Segoe UI" w:cs="Segoe UI"/>
+          <w:color w:val="CCCCCC"/>
+          <w:sz w:val="20"/>
+          <w:szCs w:val="20"/>
+        </w:rPr>
+        <w:t> trên máy tính).</w:t>
+      </w:r>
+    </w:p>
+    <w:p>
       <w:bookmarkStart w:id="0" w:name="_GoBack"/>
       <w:bookmarkEnd w:id="0"/>
     </w:p>
@@ -22515,235 +23305,9 @@
     </w:lvl>
   </w:abstractNum>
   <w:abstractNum w:abstractNumId="9">
-    <w:nsid w:val="592116E5"/>
+    <w:nsid w:val="47193CAB"/>
     <w:multiLevelType w:val="multilevel"/>
-    <w:tmpl w:val="19588DF4"/>
-    <w:lvl w:ilvl="0">
-      <w:start w:val="3"/>
-      <w:numFmt w:val="decimal"/>
-      <w:lvlText w:val="%1."/>
-      <w:lvlJc w:val="left"/>
-      <w:pPr>
-        <w:tabs>
-          <w:tab w:val="num" w:pos="720"/>
-        </w:tabs>
-        <w:ind w:left="720" w:hanging="360"/>
-      </w:pPr>
-    </w:lvl>
-    <w:lvl w:ilvl="1" w:tentative="1">
-      <w:start w:val="1"/>
-      <w:numFmt w:val="decimal"/>
-      <w:lvlText w:val="%2."/>
-      <w:lvlJc w:val="left"/>
-      <w:pPr>
-        <w:tabs>
-          <w:tab w:val="num" w:pos="1440"/>
-        </w:tabs>
-        <w:ind w:left="1440" w:hanging="360"/>
-      </w:pPr>
-    </w:lvl>
-    <w:lvl w:ilvl="2" w:tentative="1">
-      <w:start w:val="1"/>
-      <w:numFmt w:val="decimal"/>
-      <w:lvlText w:val="%3."/>
-      <w:lvlJc w:val="left"/>
-      <w:pPr>
-        <w:tabs>
-          <w:tab w:val="num" w:pos="2160"/>
-        </w:tabs>
-        <w:ind w:left="2160" w:hanging="360"/>
-      </w:pPr>
-    </w:lvl>
-    <w:lvl w:ilvl="3" w:tentative="1">
-      <w:start w:val="1"/>
-      <w:numFmt w:val="decimal"/>
-      <w:lvlText w:val="%4."/>
-      <w:lvlJc w:val="left"/>
-      <w:pPr>
-        <w:tabs>
-          <w:tab w:val="num" w:pos="2880"/>
-        </w:tabs>
-        <w:ind w:left="2880" w:hanging="360"/>
-      </w:pPr>
-    </w:lvl>
-    <w:lvl w:ilvl="4" w:tentative="1">
-      <w:start w:val="1"/>
-      <w:numFmt w:val="decimal"/>
-      <w:lvlText w:val="%5."/>
-      <w:lvlJc w:val="left"/>
-      <w:pPr>
-        <w:tabs>
-          <w:tab w:val="num" w:pos="3600"/>
-        </w:tabs>
-        <w:ind w:left="3600" w:hanging="360"/>
-      </w:pPr>
-    </w:lvl>
-    <w:lvl w:ilvl="5" w:tentative="1">
-      <w:start w:val="1"/>
-      <w:numFmt w:val="decimal"/>
-      <w:lvlText w:val="%6."/>
-      <w:lvlJc w:val="left"/>
-      <w:pPr>
-        <w:tabs>
-          <w:tab w:val="num" w:pos="4320"/>
-        </w:tabs>
-        <w:ind w:left="4320" w:hanging="360"/>
-      </w:pPr>
-    </w:lvl>
-    <w:lvl w:ilvl="6" w:tentative="1">
-      <w:start w:val="1"/>
-      <w:numFmt w:val="decimal"/>
-      <w:lvlText w:val="%7."/>
-      <w:lvlJc w:val="left"/>
-      <w:pPr>
-        <w:tabs>
-          <w:tab w:val="num" w:pos="5040"/>
-        </w:tabs>
-        <w:ind w:left="5040" w:hanging="360"/>
-      </w:pPr>
-    </w:lvl>
-    <w:lvl w:ilvl="7" w:tentative="1">
-      <w:start w:val="1"/>
-      <w:numFmt w:val="decimal"/>
-      <w:lvlText w:val="%8."/>
-      <w:lvlJc w:val="left"/>
-      <w:pPr>
-        <w:tabs>
-          <w:tab w:val="num" w:pos="5760"/>
-        </w:tabs>
-        <w:ind w:left="5760" w:hanging="360"/>
-      </w:pPr>
-    </w:lvl>
-    <w:lvl w:ilvl="8" w:tentative="1">
-      <w:start w:val="1"/>
-      <w:numFmt w:val="decimal"/>
-      <w:lvlText w:val="%9."/>
-      <w:lvlJc w:val="left"/>
-      <w:pPr>
-        <w:tabs>
-          <w:tab w:val="num" w:pos="6480"/>
-        </w:tabs>
-        <w:ind w:left="6480" w:hanging="360"/>
-      </w:pPr>
-    </w:lvl>
-  </w:abstractNum>
-  <w:abstractNum w:abstractNumId="10">
-    <w:nsid w:val="5ECC089F"/>
-    <w:multiLevelType w:val="multilevel"/>
-    <w:tmpl w:val="B5145434"/>
-    <w:lvl w:ilvl="0">
-      <w:start w:val="1"/>
-      <w:numFmt w:val="decimal"/>
-      <w:lvlText w:val="%1."/>
-      <w:lvlJc w:val="left"/>
-      <w:pPr>
-        <w:tabs>
-          <w:tab w:val="num" w:pos="720"/>
-        </w:tabs>
-        <w:ind w:left="720" w:hanging="360"/>
-      </w:pPr>
-    </w:lvl>
-    <w:lvl w:ilvl="1" w:tentative="1">
-      <w:start w:val="1"/>
-      <w:numFmt w:val="decimal"/>
-      <w:lvlText w:val="%2."/>
-      <w:lvlJc w:val="left"/>
-      <w:pPr>
-        <w:tabs>
-          <w:tab w:val="num" w:pos="1440"/>
-        </w:tabs>
-        <w:ind w:left="1440" w:hanging="360"/>
-      </w:pPr>
-    </w:lvl>
-    <w:lvl w:ilvl="2" w:tentative="1">
-      <w:start w:val="1"/>
-      <w:numFmt w:val="decimal"/>
-      <w:lvlText w:val="%3."/>
-      <w:lvlJc w:val="left"/>
-      <w:pPr>
-        <w:tabs>
-          <w:tab w:val="num" w:pos="2160"/>
-        </w:tabs>
-        <w:ind w:left="2160" w:hanging="360"/>
-      </w:pPr>
-    </w:lvl>
-    <w:lvl w:ilvl="3" w:tentative="1">
-      <w:start w:val="1"/>
-      <w:numFmt w:val="decimal"/>
-      <w:lvlText w:val="%4."/>
-      <w:lvlJc w:val="left"/>
-      <w:pPr>
-        <w:tabs>
-          <w:tab w:val="num" w:pos="2880"/>
-        </w:tabs>
-        <w:ind w:left="2880" w:hanging="360"/>
-      </w:pPr>
-    </w:lvl>
-    <w:lvl w:ilvl="4" w:tentative="1">
-      <w:start w:val="1"/>
-      <w:numFmt w:val="decimal"/>
-      <w:lvlText w:val="%5."/>
-      <w:lvlJc w:val="left"/>
-      <w:pPr>
-        <w:tabs>
-          <w:tab w:val="num" w:pos="3600"/>
-        </w:tabs>
-        <w:ind w:left="3600" w:hanging="360"/>
-      </w:pPr>
-    </w:lvl>
-    <w:lvl w:ilvl="5" w:tentative="1">
-      <w:start w:val="1"/>
-      <w:numFmt w:val="decimal"/>
-      <w:lvlText w:val="%6."/>
-      <w:lvlJc w:val="left"/>
-      <w:pPr>
-        <w:tabs>
-          <w:tab w:val="num" w:pos="4320"/>
-        </w:tabs>
-        <w:ind w:left="4320" w:hanging="360"/>
-      </w:pPr>
-    </w:lvl>
-    <w:lvl w:ilvl="6" w:tentative="1">
-      <w:start w:val="1"/>
-      <w:numFmt w:val="decimal"/>
-      <w:lvlText w:val="%7."/>
-      <w:lvlJc w:val="left"/>
-      <w:pPr>
-        <w:tabs>
-          <w:tab w:val="num" w:pos="5040"/>
-        </w:tabs>
-        <w:ind w:left="5040" w:hanging="360"/>
-      </w:pPr>
-    </w:lvl>
-    <w:lvl w:ilvl="7" w:tentative="1">
-      <w:start w:val="1"/>
-      <w:numFmt w:val="decimal"/>
-      <w:lvlText w:val="%8."/>
-      <w:lvlJc w:val="left"/>
-      <w:pPr>
-        <w:tabs>
-          <w:tab w:val="num" w:pos="5760"/>
-        </w:tabs>
-        <w:ind w:left="5760" w:hanging="360"/>
-      </w:pPr>
-    </w:lvl>
-    <w:lvl w:ilvl="8" w:tentative="1">
-      <w:start w:val="1"/>
-      <w:numFmt w:val="decimal"/>
-      <w:lvlText w:val="%9."/>
-      <w:lvlJc w:val="left"/>
-      <w:pPr>
-        <w:tabs>
-          <w:tab w:val="num" w:pos="6480"/>
-        </w:tabs>
-        <w:ind w:left="6480" w:hanging="360"/>
-      </w:pPr>
-    </w:lvl>
-  </w:abstractNum>
-  <w:abstractNum w:abstractNumId="11">
-    <w:nsid w:val="639D507D"/>
-    <w:multiLevelType w:val="multilevel"/>
-    <w:tmpl w:val="2800F95A"/>
+    <w:tmpl w:val="5DE47C84"/>
     <w:lvl w:ilvl="0">
       <w:start w:val="1"/>
       <w:numFmt w:val="decimal"/>
@@ -22857,7 +23421,350 @@
       </w:pPr>
     </w:lvl>
   </w:abstractNum>
+  <w:abstractNum w:abstractNumId="10">
+    <w:nsid w:val="592116E5"/>
+    <w:multiLevelType w:val="multilevel"/>
+    <w:tmpl w:val="19588DF4"/>
+    <w:lvl w:ilvl="0">
+      <w:start w:val="3"/>
+      <w:numFmt w:val="decimal"/>
+      <w:lvlText w:val="%1."/>
+      <w:lvlJc w:val="left"/>
+      <w:pPr>
+        <w:tabs>
+          <w:tab w:val="num" w:pos="720"/>
+        </w:tabs>
+        <w:ind w:left="720" w:hanging="360"/>
+      </w:pPr>
+    </w:lvl>
+    <w:lvl w:ilvl="1" w:tentative="1">
+      <w:start w:val="1"/>
+      <w:numFmt w:val="decimal"/>
+      <w:lvlText w:val="%2."/>
+      <w:lvlJc w:val="left"/>
+      <w:pPr>
+        <w:tabs>
+          <w:tab w:val="num" w:pos="1440"/>
+        </w:tabs>
+        <w:ind w:left="1440" w:hanging="360"/>
+      </w:pPr>
+    </w:lvl>
+    <w:lvl w:ilvl="2" w:tentative="1">
+      <w:start w:val="1"/>
+      <w:numFmt w:val="decimal"/>
+      <w:lvlText w:val="%3."/>
+      <w:lvlJc w:val="left"/>
+      <w:pPr>
+        <w:tabs>
+          <w:tab w:val="num" w:pos="2160"/>
+        </w:tabs>
+        <w:ind w:left="2160" w:hanging="360"/>
+      </w:pPr>
+    </w:lvl>
+    <w:lvl w:ilvl="3" w:tentative="1">
+      <w:start w:val="1"/>
+      <w:numFmt w:val="decimal"/>
+      <w:lvlText w:val="%4."/>
+      <w:lvlJc w:val="left"/>
+      <w:pPr>
+        <w:tabs>
+          <w:tab w:val="num" w:pos="2880"/>
+        </w:tabs>
+        <w:ind w:left="2880" w:hanging="360"/>
+      </w:pPr>
+    </w:lvl>
+    <w:lvl w:ilvl="4" w:tentative="1">
+      <w:start w:val="1"/>
+      <w:numFmt w:val="decimal"/>
+      <w:lvlText w:val="%5."/>
+      <w:lvlJc w:val="left"/>
+      <w:pPr>
+        <w:tabs>
+          <w:tab w:val="num" w:pos="3600"/>
+        </w:tabs>
+        <w:ind w:left="3600" w:hanging="360"/>
+      </w:pPr>
+    </w:lvl>
+    <w:lvl w:ilvl="5" w:tentative="1">
+      <w:start w:val="1"/>
+      <w:numFmt w:val="decimal"/>
+      <w:lvlText w:val="%6."/>
+      <w:lvlJc w:val="left"/>
+      <w:pPr>
+        <w:tabs>
+          <w:tab w:val="num" w:pos="4320"/>
+        </w:tabs>
+        <w:ind w:left="4320" w:hanging="360"/>
+      </w:pPr>
+    </w:lvl>
+    <w:lvl w:ilvl="6" w:tentative="1">
+      <w:start w:val="1"/>
+      <w:numFmt w:val="decimal"/>
+      <w:lvlText w:val="%7."/>
+      <w:lvlJc w:val="left"/>
+      <w:pPr>
+        <w:tabs>
+          <w:tab w:val="num" w:pos="5040"/>
+        </w:tabs>
+        <w:ind w:left="5040" w:hanging="360"/>
+      </w:pPr>
+    </w:lvl>
+    <w:lvl w:ilvl="7" w:tentative="1">
+      <w:start w:val="1"/>
+      <w:numFmt w:val="decimal"/>
+      <w:lvlText w:val="%8."/>
+      <w:lvlJc w:val="left"/>
+      <w:pPr>
+        <w:tabs>
+          <w:tab w:val="num" w:pos="5760"/>
+        </w:tabs>
+        <w:ind w:left="5760" w:hanging="360"/>
+      </w:pPr>
+    </w:lvl>
+    <w:lvl w:ilvl="8" w:tentative="1">
+      <w:start w:val="1"/>
+      <w:numFmt w:val="decimal"/>
+      <w:lvlText w:val="%9."/>
+      <w:lvlJc w:val="left"/>
+      <w:pPr>
+        <w:tabs>
+          <w:tab w:val="num" w:pos="6480"/>
+        </w:tabs>
+        <w:ind w:left="6480" w:hanging="360"/>
+      </w:pPr>
+    </w:lvl>
+  </w:abstractNum>
+  <w:abstractNum w:abstractNumId="11">
+    <w:nsid w:val="5ECC089F"/>
+    <w:multiLevelType w:val="multilevel"/>
+    <w:tmpl w:val="B5145434"/>
+    <w:lvl w:ilvl="0">
+      <w:start w:val="1"/>
+      <w:numFmt w:val="decimal"/>
+      <w:lvlText w:val="%1."/>
+      <w:lvlJc w:val="left"/>
+      <w:pPr>
+        <w:tabs>
+          <w:tab w:val="num" w:pos="720"/>
+        </w:tabs>
+        <w:ind w:left="720" w:hanging="360"/>
+      </w:pPr>
+    </w:lvl>
+    <w:lvl w:ilvl="1" w:tentative="1">
+      <w:start w:val="1"/>
+      <w:numFmt w:val="decimal"/>
+      <w:lvlText w:val="%2."/>
+      <w:lvlJc w:val="left"/>
+      <w:pPr>
+        <w:tabs>
+          <w:tab w:val="num" w:pos="1440"/>
+        </w:tabs>
+        <w:ind w:left="1440" w:hanging="360"/>
+      </w:pPr>
+    </w:lvl>
+    <w:lvl w:ilvl="2" w:tentative="1">
+      <w:start w:val="1"/>
+      <w:numFmt w:val="decimal"/>
+      <w:lvlText w:val="%3."/>
+      <w:lvlJc w:val="left"/>
+      <w:pPr>
+        <w:tabs>
+          <w:tab w:val="num" w:pos="2160"/>
+        </w:tabs>
+        <w:ind w:left="2160" w:hanging="360"/>
+      </w:pPr>
+    </w:lvl>
+    <w:lvl w:ilvl="3" w:tentative="1">
+      <w:start w:val="1"/>
+      <w:numFmt w:val="decimal"/>
+      <w:lvlText w:val="%4."/>
+      <w:lvlJc w:val="left"/>
+      <w:pPr>
+        <w:tabs>
+          <w:tab w:val="num" w:pos="2880"/>
+        </w:tabs>
+        <w:ind w:left="2880" w:hanging="360"/>
+      </w:pPr>
+    </w:lvl>
+    <w:lvl w:ilvl="4" w:tentative="1">
+      <w:start w:val="1"/>
+      <w:numFmt w:val="decimal"/>
+      <w:lvlText w:val="%5."/>
+      <w:lvlJc w:val="left"/>
+      <w:pPr>
+        <w:tabs>
+          <w:tab w:val="num" w:pos="3600"/>
+        </w:tabs>
+        <w:ind w:left="3600" w:hanging="360"/>
+      </w:pPr>
+    </w:lvl>
+    <w:lvl w:ilvl="5" w:tentative="1">
+      <w:start w:val="1"/>
+      <w:numFmt w:val="decimal"/>
+      <w:lvlText w:val="%6."/>
+      <w:lvlJc w:val="left"/>
+      <w:pPr>
+        <w:tabs>
+          <w:tab w:val="num" w:pos="4320"/>
+        </w:tabs>
+        <w:ind w:left="4320" w:hanging="360"/>
+      </w:pPr>
+    </w:lvl>
+    <w:lvl w:ilvl="6" w:tentative="1">
+      <w:start w:val="1"/>
+      <w:numFmt w:val="decimal"/>
+      <w:lvlText w:val="%7."/>
+      <w:lvlJc w:val="left"/>
+      <w:pPr>
+        <w:tabs>
+          <w:tab w:val="num" w:pos="5040"/>
+        </w:tabs>
+        <w:ind w:left="5040" w:hanging="360"/>
+      </w:pPr>
+    </w:lvl>
+    <w:lvl w:ilvl="7" w:tentative="1">
+      <w:start w:val="1"/>
+      <w:numFmt w:val="decimal"/>
+      <w:lvlText w:val="%8."/>
+      <w:lvlJc w:val="left"/>
+      <w:pPr>
+        <w:tabs>
+          <w:tab w:val="num" w:pos="5760"/>
+        </w:tabs>
+        <w:ind w:left="5760" w:hanging="360"/>
+      </w:pPr>
+    </w:lvl>
+    <w:lvl w:ilvl="8" w:tentative="1">
+      <w:start w:val="1"/>
+      <w:numFmt w:val="decimal"/>
+      <w:lvlText w:val="%9."/>
+      <w:lvlJc w:val="left"/>
+      <w:pPr>
+        <w:tabs>
+          <w:tab w:val="num" w:pos="6480"/>
+        </w:tabs>
+        <w:ind w:left="6480" w:hanging="360"/>
+      </w:pPr>
+    </w:lvl>
+  </w:abstractNum>
   <w:abstractNum w:abstractNumId="12">
+    <w:nsid w:val="639D507D"/>
+    <w:multiLevelType w:val="multilevel"/>
+    <w:tmpl w:val="2800F95A"/>
+    <w:lvl w:ilvl="0">
+      <w:start w:val="1"/>
+      <w:numFmt w:val="decimal"/>
+      <w:lvlText w:val="%1."/>
+      <w:lvlJc w:val="left"/>
+      <w:pPr>
+        <w:tabs>
+          <w:tab w:val="num" w:pos="720"/>
+        </w:tabs>
+        <w:ind w:left="720" w:hanging="360"/>
+      </w:pPr>
+    </w:lvl>
+    <w:lvl w:ilvl="1">
+      <w:start w:val="1"/>
+      <w:numFmt w:val="bullet"/>
+      <w:lvlText w:val=""/>
+      <w:lvlJc w:val="left"/>
+      <w:pPr>
+        <w:tabs>
+          <w:tab w:val="num" w:pos="1440"/>
+        </w:tabs>
+        <w:ind w:left="1440" w:hanging="360"/>
+      </w:pPr>
+      <w:rPr>
+        <w:rFonts w:ascii="Symbol" w:hAnsi="Symbol" w:hint="default"/>
+        <w:sz w:val="20"/>
+      </w:rPr>
+    </w:lvl>
+    <w:lvl w:ilvl="2" w:tentative="1">
+      <w:start w:val="1"/>
+      <w:numFmt w:val="decimal"/>
+      <w:lvlText w:val="%3."/>
+      <w:lvlJc w:val="left"/>
+      <w:pPr>
+        <w:tabs>
+          <w:tab w:val="num" w:pos="2160"/>
+        </w:tabs>
+        <w:ind w:left="2160" w:hanging="360"/>
+      </w:pPr>
+    </w:lvl>
+    <w:lvl w:ilvl="3" w:tentative="1">
+      <w:start w:val="1"/>
+      <w:numFmt w:val="decimal"/>
+      <w:lvlText w:val="%4."/>
+      <w:lvlJc w:val="left"/>
+      <w:pPr>
+        <w:tabs>
+          <w:tab w:val="num" w:pos="2880"/>
+        </w:tabs>
+        <w:ind w:left="2880" w:hanging="360"/>
+      </w:pPr>
+    </w:lvl>
+    <w:lvl w:ilvl="4" w:tentative="1">
+      <w:start w:val="1"/>
+      <w:numFmt w:val="decimal"/>
+      <w:lvlText w:val="%5."/>
+      <w:lvlJc w:val="left"/>
+      <w:pPr>
+        <w:tabs>
+          <w:tab w:val="num" w:pos="3600"/>
+        </w:tabs>
+        <w:ind w:left="3600" w:hanging="360"/>
+      </w:pPr>
+    </w:lvl>
+    <w:lvl w:ilvl="5" w:tentative="1">
+      <w:start w:val="1"/>
+      <w:numFmt w:val="decimal"/>
+      <w:lvlText w:val="%6."/>
+      <w:lvlJc w:val="left"/>
+      <w:pPr>
+        <w:tabs>
+          <w:tab w:val="num" w:pos="4320"/>
+        </w:tabs>
+        <w:ind w:left="4320" w:hanging="360"/>
+      </w:pPr>
+    </w:lvl>
+    <w:lvl w:ilvl="6" w:tentative="1">
+      <w:start w:val="1"/>
+      <w:numFmt w:val="decimal"/>
+      <w:lvlText w:val="%7."/>
+      <w:lvlJc w:val="left"/>
+      <w:pPr>
+        <w:tabs>
+          <w:tab w:val="num" w:pos="5040"/>
+        </w:tabs>
+        <w:ind w:left="5040" w:hanging="360"/>
+      </w:pPr>
+    </w:lvl>
+    <w:lvl w:ilvl="7" w:tentative="1">
+      <w:start w:val="1"/>
+      <w:numFmt w:val="decimal"/>
+      <w:lvlText w:val="%8."/>
+      <w:lvlJc w:val="left"/>
+      <w:pPr>
+        <w:tabs>
+          <w:tab w:val="num" w:pos="5760"/>
+        </w:tabs>
+        <w:ind w:left="5760" w:hanging="360"/>
+      </w:pPr>
+    </w:lvl>
+    <w:lvl w:ilvl="8" w:tentative="1">
+      <w:start w:val="1"/>
+      <w:numFmt w:val="decimal"/>
+      <w:lvlText w:val="%9."/>
+      <w:lvlJc w:val="left"/>
+      <w:pPr>
+        <w:tabs>
+          <w:tab w:val="num" w:pos="6480"/>
+        </w:tabs>
+        <w:ind w:left="6480" w:hanging="360"/>
+      </w:pPr>
+    </w:lvl>
+  </w:abstractNum>
+  <w:abstractNum w:abstractNumId="13">
     <w:nsid w:val="737E695D"/>
     <w:multiLevelType w:val="multilevel"/>
     <w:tmpl w:val="A3EAF22C"/>
@@ -22970,7 +23877,7 @@
       </w:pPr>
     </w:lvl>
   </w:abstractNum>
-  <w:abstractNum w:abstractNumId="13">
+  <w:abstractNum w:abstractNumId="14">
     <w:nsid w:val="789B12EC"/>
     <w:multiLevelType w:val="multilevel"/>
     <w:tmpl w:val="4836AAE2"/>
@@ -23123,7 +24030,7 @@
     <w:abstractNumId w:val="7"/>
   </w:num>
   <w:num w:numId="2">
-    <w:abstractNumId w:val="13"/>
+    <w:abstractNumId w:val="14"/>
   </w:num>
   <w:num w:numId="3">
     <w:abstractNumId w:val="3"/>
@@ -23141,25 +24048,28 @@
     <w:abstractNumId w:val="5"/>
   </w:num>
   <w:num w:numId="8">
-    <w:abstractNumId w:val="10"/>
+    <w:abstractNumId w:val="11"/>
   </w:num>
   <w:num w:numId="9">
-    <w:abstractNumId w:val="12"/>
+    <w:abstractNumId w:val="13"/>
   </w:num>
   <w:num w:numId="10">
     <w:abstractNumId w:val="2"/>
   </w:num>
   <w:num w:numId="11">
-    <w:abstractNumId w:val="9"/>
+    <w:abstractNumId w:val="10"/>
   </w:num>
   <w:num w:numId="12">
     <w:abstractNumId w:val="6"/>
   </w:num>
   <w:num w:numId="13">
-    <w:abstractNumId w:val="11"/>
+    <w:abstractNumId w:val="12"/>
   </w:num>
   <w:num w:numId="14">
     <w:abstractNumId w:val="8"/>
+  </w:num>
+  <w:num w:numId="15">
+    <w:abstractNumId w:val="9"/>
   </w:num>
 </w:numbering>
 </file>

</xml_diff>